<commit_message>
feat(qts): payment terms Net N, CRM bridge split, approve without Task
Make payment days editable into the Writer merge, split CRM_Bridge into
per-action workflows to stay under Creator external-call limits, and have
Approve mark Executed without creating CRM Tasks.
</commit_message>
<xml_diff>
--- a/artifacts/qts_quote_template_v4.docx
+++ b/artifacts/qts_quote_template_v4.docx
@@ -1610,11 +1610,42 @@
       <w:r>
         <w:rPr>
           <w:rFonts w:ascii="Arial" w:hAnsi="Arial"/>
-          <w:b w:val="0"/>
           <w:color w:val="111111"/>
           <w:sz w:val="18"/>
         </w:rPr>
-        <w:t>Payment Terms: Net 30.</w:t>
+        <w:fldChar w:fldCharType="begin"/>
+      </w:r>
+      <w:r>
+        <w:rPr>
+          <w:rFonts w:ascii="Arial" w:hAnsi="Arial"/>
+          <w:color w:val="111111"/>
+          <w:sz w:val="18"/>
+        </w:rPr>
+        <w:instrText xml:space="preserve"> MERGEFIELD  "payment_terms"  \* MERGEFORMAT </w:instrText>
+      </w:r>
+      <w:r>
+        <w:rPr>
+          <w:rFonts w:ascii="Arial" w:hAnsi="Arial"/>
+          <w:color w:val="111111"/>
+          <w:sz w:val="18"/>
+        </w:rPr>
+        <w:fldChar w:fldCharType="separate"/>
+      </w:r>
+      <w:r>
+        <w:rPr>
+          <w:rFonts w:ascii="Arial" w:hAnsi="Arial"/>
+          <w:color w:val="111111"/>
+          <w:sz w:val="18"/>
+        </w:rPr>
+        <w:t xml:space="preserve">«payment_terms»</w:t>
+      </w:r>
+      <w:r>
+        <w:rPr>
+          <w:rFonts w:ascii="Arial" w:hAnsi="Arial"/>
+          <w:color w:val="111111"/>
+          <w:sz w:val="18"/>
+        </w:rPr>
+        <w:fldChar w:fldCharType="end"/>
       </w:r>
     </w:p>
     <w:p>

</xml_diff>